<commit_message>
added ai pi cam to the budget list
</commit_message>
<xml_diff>
--- a/Documents/Final Year Project Report – Smart Ai-driven Fire Detection And Suppression System.docx
+++ b/Documents/Final Year Project Report – Smart Ai-driven Fire Detection And Suppression System.docx
@@ -661,27 +661,7 @@
                 <w:bCs/>
                 <w:noProof/>
               </w:rPr>
-              <w:t>Final Year P</w:t>
-            </w:r>
-            <w:r>
-              <w:rPr>
-                <w:rStyle w:val="Hyperlink"/>
-                <w:rFonts w:asciiTheme="majorBidi" w:hAnsiTheme="majorBidi"/>
-                <w:b/>
-                <w:bCs/>
-                <w:noProof/>
-              </w:rPr>
-              <w:t>r</w:t>
-            </w:r>
-            <w:r>
-              <w:rPr>
-                <w:rStyle w:val="Hyperlink"/>
-                <w:rFonts w:asciiTheme="majorBidi" w:hAnsiTheme="majorBidi"/>
-                <w:b/>
-                <w:bCs/>
-                <w:noProof/>
-              </w:rPr>
-              <w:t>oject Report</w:t>
+              <w:t>Final Year Project Report</w:t>
             </w:r>
             <w:r>
               <w:rPr>
@@ -2011,27 +1991,7 @@
                 <w:bCs/>
                 <w:noProof/>
               </w:rPr>
-              <w:t>3.1 Overall System A</w:t>
-            </w:r>
-            <w:r>
-              <w:rPr>
-                <w:rStyle w:val="Hyperlink"/>
-                <w:rFonts w:asciiTheme="majorBidi" w:hAnsiTheme="majorBidi"/>
-                <w:b/>
-                <w:bCs/>
-                <w:noProof/>
-              </w:rPr>
-              <w:t>r</w:t>
-            </w:r>
-            <w:r>
-              <w:rPr>
-                <w:rStyle w:val="Hyperlink"/>
-                <w:rFonts w:asciiTheme="majorBidi" w:hAnsiTheme="majorBidi"/>
-                <w:b/>
-                <w:bCs/>
-                <w:noProof/>
-              </w:rPr>
-              <w:t>chitecture</w:t>
+              <w:t>3.1 Overall System Architecture</w:t>
             </w:r>
             <w:r>
               <w:rPr>
@@ -5039,6 +4999,7 @@
     </w:p>
     <w:p>
       <w:pPr>
+        <w:pStyle w:val="ListParagraph"/>
         <w:rPr>
           <w:rFonts w:asciiTheme="majorBidi" w:hAnsiTheme="majorBidi"/>
           <w:b/>
@@ -5051,6 +5012,64 @@
       <w:bookmarkStart w:id="43" w:name="chapter-4-methodology"/>
       <w:bookmarkEnd w:id="34"/>
       <w:bookmarkEnd w:id="41"/>
+      <w:r>
+        <w:rPr>
+          <w:rFonts w:asciiTheme="majorBidi" w:hAnsiTheme="majorBidi"/>
+          <w:b/>
+          <w:bCs/>
+          <w:sz w:val="36"/>
+          <w:szCs w:val="36"/>
+        </w:rPr>
+        <w:drawing>
+          <wp:anchor distT="0" distB="0" distL="114300" distR="114300" simplePos="0" relativeHeight="251662336" behindDoc="0" locked="0" layoutInCell="1" allowOverlap="1" wp14:anchorId="643AB603" wp14:editId="3C1E6AE6">
+            <wp:simplePos x="0" y="0"/>
+            <wp:positionH relativeFrom="margin">
+              <wp:align>right</wp:align>
+            </wp:positionH>
+            <wp:positionV relativeFrom="paragraph">
+              <wp:posOffset>403225</wp:posOffset>
+            </wp:positionV>
+            <wp:extent cx="5943600" cy="2463165"/>
+            <wp:effectExtent l="0" t="0" r="0" b="0"/>
+            <wp:wrapTopAndBottom/>
+            <wp:docPr id="902234074" name="Picture 1"/>
+            <wp:cNvGraphicFramePr>
+              <a:graphicFrameLocks xmlns:a="http://schemas.openxmlformats.org/drawingml/2006/main" noChangeAspect="1"/>
+            </wp:cNvGraphicFramePr>
+            <a:graphic xmlns:a="http://schemas.openxmlformats.org/drawingml/2006/main">
+              <a:graphicData uri="http://schemas.openxmlformats.org/drawingml/2006/picture">
+                <pic:pic xmlns:pic="http://schemas.openxmlformats.org/drawingml/2006/picture">
+                  <pic:nvPicPr>
+                    <pic:cNvPr id="902234074" name=""/>
+                    <pic:cNvPicPr/>
+                  </pic:nvPicPr>
+                  <pic:blipFill>
+                    <a:blip r:embed="rId9" cstate="print">
+                      <a:extLst>
+                        <a:ext uri="{28A0092B-C50C-407E-A947-70E740481C1C}">
+                          <a14:useLocalDpi xmlns:a14="http://schemas.microsoft.com/office/drawing/2010/main" val="0"/>
+                        </a:ext>
+                      </a:extLst>
+                    </a:blip>
+                    <a:stretch>
+                      <a:fillRect/>
+                    </a:stretch>
+                  </pic:blipFill>
+                  <pic:spPr>
+                    <a:xfrm>
+                      <a:off x="0" y="0"/>
+                      <a:ext cx="5943600" cy="2463165"/>
+                    </a:xfrm>
+                    <a:prstGeom prst="rect">
+                      <a:avLst/>
+                    </a:prstGeom>
+                  </pic:spPr>
+                </pic:pic>
+              </a:graphicData>
+            </a:graphic>
+          </wp:anchor>
+        </w:drawing>
+      </w:r>
       <w:r>
         <w:rPr>
           <w:noProof/>
@@ -5161,7 +5180,7 @@
                 <v:stroke joinstyle="miter"/>
                 <v:path gradientshapeok="t" o:connecttype="rect"/>
               </v:shapetype>
-              <v:shape id="Text Box 2" o:spid="_x0000_s1026" type="#_x0000_t202" style="position:absolute;margin-left:0;margin-top:227.6pt;width:468pt;height:20.65pt;z-index:251661312;visibility:visible;mso-wrap-style:square;mso-width-percent:0;mso-height-percent:0;mso-wrap-distance-left:9pt;mso-wrap-distance-top:0;mso-wrap-distance-right:9pt;mso-wrap-distance-bottom:0;mso-position-horizontal:absolute;mso-position-horizontal-relative:text;mso-position-vertical:absolute;mso-position-vertical-relative:text;mso-width-percent:0;mso-height-percent:0;mso-width-relative:page;mso-height-relative:page;v-text-anchor:top" o:gfxdata="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" stroked="f">
+              <v:shape id="Text Box 2" o:spid="_x0000_s1026" type="#_x0000_t202" style="position:absolute;left:0;text-align:left;margin-left:0;margin-top:227.6pt;width:468pt;height:20.65pt;z-index:251661312;visibility:visible;mso-wrap-style:square;mso-width-percent:0;mso-height-percent:0;mso-wrap-distance-left:9pt;mso-wrap-distance-top:0;mso-wrap-distance-right:9pt;mso-wrap-distance-bottom:0;mso-position-horizontal:absolute;mso-position-horizontal-relative:text;mso-position-vertical:absolute;mso-position-vertical-relative:text;mso-width-percent:0;mso-height-percent:0;mso-width-relative:page;mso-height-relative:page;v-text-anchor:top" o:gfxdata="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" stroked="f">
                 <v:textbox style="mso-fit-shape-to-text:t" inset="0,0,0,0">
                   <w:txbxContent>
                     <w:p>
@@ -5204,64 +5223,6 @@
       </w:r>
       <w:r>
         <w:rPr>
-          <w:rFonts w:asciiTheme="majorBidi" w:eastAsiaTheme="majorEastAsia" w:hAnsiTheme="majorBidi" w:cstheme="majorBidi"/>
-          <w:b/>
-          <w:bCs/>
-          <w:sz w:val="36"/>
-          <w:szCs w:val="36"/>
-        </w:rPr>
-        <w:drawing>
-          <wp:anchor distT="0" distB="0" distL="114300" distR="114300" simplePos="0" relativeHeight="251660288" behindDoc="0" locked="0" layoutInCell="1" allowOverlap="1" wp14:anchorId="54807C9B" wp14:editId="193929DD">
-            <wp:simplePos x="0" y="0"/>
-            <wp:positionH relativeFrom="column">
-              <wp:posOffset>0</wp:posOffset>
-            </wp:positionH>
-            <wp:positionV relativeFrom="paragraph">
-              <wp:posOffset>162015</wp:posOffset>
-            </wp:positionV>
-            <wp:extent cx="5943600" cy="2671445"/>
-            <wp:effectExtent l="0" t="0" r="0" b="0"/>
-            <wp:wrapTopAndBottom/>
-            <wp:docPr id="1045605120" name="Picture 1"/>
-            <wp:cNvGraphicFramePr>
-              <a:graphicFrameLocks xmlns:a="http://schemas.openxmlformats.org/drawingml/2006/main" noChangeAspect="1"/>
-            </wp:cNvGraphicFramePr>
-            <a:graphic xmlns:a="http://schemas.openxmlformats.org/drawingml/2006/main">
-              <a:graphicData uri="http://schemas.openxmlformats.org/drawingml/2006/picture">
-                <pic:pic xmlns:pic="http://schemas.openxmlformats.org/drawingml/2006/picture">
-                  <pic:nvPicPr>
-                    <pic:cNvPr id="1045605120" name=""/>
-                    <pic:cNvPicPr/>
-                  </pic:nvPicPr>
-                  <pic:blipFill>
-                    <a:blip r:embed="rId9" cstate="print">
-                      <a:extLst>
-                        <a:ext uri="{28A0092B-C50C-407E-A947-70E740481C1C}">
-                          <a14:useLocalDpi xmlns:a14="http://schemas.microsoft.com/office/drawing/2010/main" val="0"/>
-                        </a:ext>
-                      </a:extLst>
-                    </a:blip>
-                    <a:stretch>
-                      <a:fillRect/>
-                    </a:stretch>
-                  </pic:blipFill>
-                  <pic:spPr>
-                    <a:xfrm>
-                      <a:off x="0" y="0"/>
-                      <a:ext cx="5943600" cy="2671445"/>
-                    </a:xfrm>
-                    <a:prstGeom prst="rect">
-                      <a:avLst/>
-                    </a:prstGeom>
-                  </pic:spPr>
-                </pic:pic>
-              </a:graphicData>
-            </a:graphic>
-          </wp:anchor>
-        </w:drawing>
-      </w:r>
-      <w:r>
-        <w:rPr>
           <w:rFonts w:asciiTheme="majorBidi" w:hAnsiTheme="majorBidi"/>
           <w:b/>
           <w:bCs/>
@@ -5489,7 +5450,19 @@
         <w:rPr>
           <w:rFonts w:asciiTheme="majorBidi" w:hAnsiTheme="majorBidi" w:cstheme="majorBidi"/>
         </w:rPr>
-        <w:t>Video frames are captured in real time and resized for efficient inference. Noise reduction and color normalization improve robustness under varying lighting conditions.</w:t>
+        <w:t xml:space="preserve">Video frames are captured in real time </w:t>
+      </w:r>
+      <w:r>
+        <w:rPr>
+          <w:rFonts w:asciiTheme="majorBidi" w:hAnsiTheme="majorBidi" w:cstheme="majorBidi"/>
+        </w:rPr>
+        <w:t xml:space="preserve">using a raspberry pi ai camera (might use existing wall mounted security camera for industrial expansion and budget efficiency) </w:t>
+      </w:r>
+      <w:r>
+        <w:rPr>
+          <w:rFonts w:asciiTheme="majorBidi" w:hAnsiTheme="majorBidi" w:cstheme="majorBidi"/>
+        </w:rPr>
+        <w:t>resized for efficient inference. Noise reduction and color normalization improve robustness under varying lighting conditions.</w:t>
       </w:r>
     </w:p>
     <w:p>
@@ -5975,7 +5948,7 @@
         </w:trPr>
         <w:tc>
           <w:tcPr>
-            <w:tcW w:w="2961" w:type="dxa"/>
+            <w:tcW w:w="2888" w:type="dxa"/>
           </w:tcPr>
           <w:p>
             <w:pPr>
@@ -5994,7 +5967,7 @@
         </w:tc>
         <w:tc>
           <w:tcPr>
-            <w:tcW w:w="1614" w:type="dxa"/>
+            <w:tcW w:w="1577" w:type="dxa"/>
           </w:tcPr>
           <w:p>
             <w:pPr>
@@ -6013,7 +5986,7 @@
         </w:tc>
         <w:tc>
           <w:tcPr>
-            <w:tcW w:w="1480" w:type="dxa"/>
+            <w:tcW w:w="1446" w:type="dxa"/>
           </w:tcPr>
           <w:p>
             <w:pPr>
@@ -6032,7 +6005,7 @@
         </w:tc>
         <w:tc>
           <w:tcPr>
-            <w:tcW w:w="1414" w:type="dxa"/>
+            <w:tcW w:w="1382" w:type="dxa"/>
           </w:tcPr>
           <w:p>
             <w:pPr>
@@ -6051,7 +6024,7 @@
         </w:tc>
         <w:tc>
           <w:tcPr>
-            <w:tcW w:w="2083" w:type="dxa"/>
+            <w:tcW w:w="2033" w:type="dxa"/>
           </w:tcPr>
           <w:p>
             <w:pPr>
@@ -6075,7 +6048,7 @@
         </w:trPr>
         <w:tc>
           <w:tcPr>
-            <w:tcW w:w="2961" w:type="dxa"/>
+            <w:tcW w:w="2888" w:type="dxa"/>
           </w:tcPr>
           <w:p>
             <w:pPr>
@@ -6094,7 +6067,7 @@
         </w:tc>
         <w:tc>
           <w:tcPr>
-            <w:tcW w:w="1614" w:type="dxa"/>
+            <w:tcW w:w="1577" w:type="dxa"/>
           </w:tcPr>
           <w:p>
             <w:pPr>
@@ -6113,7 +6086,7 @@
         </w:tc>
         <w:tc>
           <w:tcPr>
-            <w:tcW w:w="1480" w:type="dxa"/>
+            <w:tcW w:w="1446" w:type="dxa"/>
           </w:tcPr>
           <w:p>
             <w:pPr>
@@ -6132,7 +6105,7 @@
         </w:tc>
         <w:tc>
           <w:tcPr>
-            <w:tcW w:w="1414" w:type="dxa"/>
+            <w:tcW w:w="1382" w:type="dxa"/>
           </w:tcPr>
           <w:p>
             <w:pPr>
@@ -6151,7 +6124,7 @@
         </w:tc>
         <w:tc>
           <w:tcPr>
-            <w:tcW w:w="2083" w:type="dxa"/>
+            <w:tcW w:w="2033" w:type="dxa"/>
           </w:tcPr>
           <w:p>
             <w:pPr>
@@ -6175,7 +6148,7 @@
         </w:trPr>
         <w:tc>
           <w:tcPr>
-            <w:tcW w:w="2961" w:type="dxa"/>
+            <w:tcW w:w="2888" w:type="dxa"/>
           </w:tcPr>
           <w:p>
             <w:pPr>
@@ -6195,7 +6168,7 @@
         </w:tc>
         <w:tc>
           <w:tcPr>
-            <w:tcW w:w="1614" w:type="dxa"/>
+            <w:tcW w:w="1577" w:type="dxa"/>
           </w:tcPr>
           <w:p>
             <w:pPr>
@@ -6222,7 +6195,7 @@
         </w:tc>
         <w:tc>
           <w:tcPr>
-            <w:tcW w:w="1480" w:type="dxa"/>
+            <w:tcW w:w="1446" w:type="dxa"/>
           </w:tcPr>
           <w:p>
             <w:pPr>
@@ -6241,7 +6214,7 @@
         </w:tc>
         <w:tc>
           <w:tcPr>
-            <w:tcW w:w="1414" w:type="dxa"/>
+            <w:tcW w:w="1382" w:type="dxa"/>
           </w:tcPr>
           <w:p>
             <w:pPr>
@@ -6260,7 +6233,7 @@
         </w:tc>
         <w:tc>
           <w:tcPr>
-            <w:tcW w:w="2083" w:type="dxa"/>
+            <w:tcW w:w="2033" w:type="dxa"/>
           </w:tcPr>
           <w:p>
             <w:pPr>
@@ -6284,7 +6257,7 @@
         </w:trPr>
         <w:tc>
           <w:tcPr>
-            <w:tcW w:w="2961" w:type="dxa"/>
+            <w:tcW w:w="2888" w:type="dxa"/>
           </w:tcPr>
           <w:p>
             <w:pPr>
@@ -6303,7 +6276,7 @@
         </w:tc>
         <w:tc>
           <w:tcPr>
-            <w:tcW w:w="1614" w:type="dxa"/>
+            <w:tcW w:w="1577" w:type="dxa"/>
           </w:tcPr>
           <w:p>
             <w:pPr>
@@ -6330,7 +6303,7 @@
         </w:tc>
         <w:tc>
           <w:tcPr>
-            <w:tcW w:w="1480" w:type="dxa"/>
+            <w:tcW w:w="1446" w:type="dxa"/>
           </w:tcPr>
           <w:p>
             <w:pPr>
@@ -6349,7 +6322,7 @@
         </w:tc>
         <w:tc>
           <w:tcPr>
-            <w:tcW w:w="1414" w:type="dxa"/>
+            <w:tcW w:w="1382" w:type="dxa"/>
           </w:tcPr>
           <w:p>
             <w:pPr>
@@ -6368,7 +6341,7 @@
         </w:tc>
         <w:tc>
           <w:tcPr>
-            <w:tcW w:w="2083" w:type="dxa"/>
+            <w:tcW w:w="2033" w:type="dxa"/>
           </w:tcPr>
           <w:p>
             <w:pPr>
@@ -6392,7 +6365,7 @@
         </w:trPr>
         <w:tc>
           <w:tcPr>
-            <w:tcW w:w="2961" w:type="dxa"/>
+            <w:tcW w:w="2888" w:type="dxa"/>
           </w:tcPr>
           <w:p>
             <w:pPr>
@@ -6419,7 +6392,7 @@
         </w:tc>
         <w:tc>
           <w:tcPr>
-            <w:tcW w:w="1614" w:type="dxa"/>
+            <w:tcW w:w="1577" w:type="dxa"/>
           </w:tcPr>
           <w:p>
             <w:pPr>
@@ -6438,7 +6411,7 @@
         </w:tc>
         <w:tc>
           <w:tcPr>
-            <w:tcW w:w="1480" w:type="dxa"/>
+            <w:tcW w:w="1446" w:type="dxa"/>
           </w:tcPr>
           <w:p>
             <w:pPr>
@@ -6457,7 +6430,7 @@
         </w:tc>
         <w:tc>
           <w:tcPr>
-            <w:tcW w:w="1414" w:type="dxa"/>
+            <w:tcW w:w="1382" w:type="dxa"/>
           </w:tcPr>
           <w:p>
             <w:pPr>
@@ -6476,7 +6449,7 @@
         </w:tc>
         <w:tc>
           <w:tcPr>
-            <w:tcW w:w="2083" w:type="dxa"/>
+            <w:tcW w:w="2033" w:type="dxa"/>
           </w:tcPr>
           <w:p>
             <w:pPr>
@@ -6500,7 +6473,7 @@
         </w:trPr>
         <w:tc>
           <w:tcPr>
-            <w:tcW w:w="2961" w:type="dxa"/>
+            <w:tcW w:w="2888" w:type="dxa"/>
           </w:tcPr>
           <w:p>
             <w:pPr>
@@ -6519,7 +6492,7 @@
         </w:tc>
         <w:tc>
           <w:tcPr>
-            <w:tcW w:w="1614" w:type="dxa"/>
+            <w:tcW w:w="1577" w:type="dxa"/>
           </w:tcPr>
           <w:p>
             <w:pPr>
@@ -6538,7 +6511,7 @@
         </w:tc>
         <w:tc>
           <w:tcPr>
-            <w:tcW w:w="1480" w:type="dxa"/>
+            <w:tcW w:w="1446" w:type="dxa"/>
           </w:tcPr>
           <w:p>
             <w:pPr>
@@ -6557,7 +6530,7 @@
         </w:tc>
         <w:tc>
           <w:tcPr>
-            <w:tcW w:w="1414" w:type="dxa"/>
+            <w:tcW w:w="1382" w:type="dxa"/>
           </w:tcPr>
           <w:p>
             <w:pPr>
@@ -6576,7 +6549,7 @@
         </w:tc>
         <w:tc>
           <w:tcPr>
-            <w:tcW w:w="2083" w:type="dxa"/>
+            <w:tcW w:w="2033" w:type="dxa"/>
           </w:tcPr>
           <w:p>
             <w:pPr>
@@ -6592,6 +6565,163 @@
               </w:rPr>
               <w:t>Professional-grade thermal imaging; higher cost but superior accuracy</w:t>
             </w:r>
+          </w:p>
+        </w:tc>
+      </w:tr>
+      <w:tr>
+        <w:trPr>
+          <w:trHeight w:val="1133"/>
+        </w:trPr>
+        <w:tc>
+          <w:tcPr>
+            <w:tcW w:w="2888" w:type="dxa"/>
+          </w:tcPr>
+          <w:p>
+            <w:pPr>
+              <w:pStyle w:val="Compact"/>
+              <w:rPr>
+                <w:rFonts w:asciiTheme="majorBidi" w:hAnsiTheme="majorBidi" w:cstheme="majorBidi"/>
+              </w:rPr>
+            </w:pPr>
+            <w:r>
+              <w:rPr>
+                <w:rFonts w:asciiTheme="majorBidi" w:hAnsiTheme="majorBidi" w:cstheme="majorBidi"/>
+              </w:rPr>
+              <w:t>Raspberry PI ai camera</w:t>
+            </w:r>
+          </w:p>
+          <w:p>
+            <w:pPr>
+              <w:pStyle w:val="Compact"/>
+              <w:rPr>
+                <w:rFonts w:asciiTheme="majorBidi" w:hAnsiTheme="majorBidi" w:cstheme="majorBidi"/>
+              </w:rPr>
+            </w:pPr>
+            <w:r>
+              <w:rPr>
+                <w:rFonts w:asciiTheme="majorBidi" w:hAnsiTheme="majorBidi" w:cstheme="majorBidi"/>
+              </w:rPr>
+              <w:t>(best option)</w:t>
+            </w:r>
+          </w:p>
+        </w:tc>
+        <w:tc>
+          <w:tcPr>
+            <w:tcW w:w="1577" w:type="dxa"/>
+          </w:tcPr>
+          <w:p>
+            <w:pPr>
+              <w:pStyle w:val="Compact"/>
+              <w:rPr>
+                <w:rFonts w:asciiTheme="majorBidi" w:hAnsiTheme="majorBidi" w:cstheme="majorBidi"/>
+              </w:rPr>
+            </w:pPr>
+            <w:r>
+              <w:rPr>
+                <w:rFonts w:asciiTheme="majorBidi" w:hAnsiTheme="majorBidi" w:cstheme="majorBidi"/>
+              </w:rPr>
+              <w:t>12.3 Mega pixels</w:t>
+            </w:r>
+          </w:p>
+        </w:tc>
+        <w:tc>
+          <w:tcPr>
+            <w:tcW w:w="1446" w:type="dxa"/>
+          </w:tcPr>
+          <w:p>
+            <w:pPr>
+              <w:pStyle w:val="Compact"/>
+              <w:rPr>
+                <w:rFonts w:asciiTheme="majorBidi" w:hAnsiTheme="majorBidi" w:cstheme="majorBidi"/>
+              </w:rPr>
+            </w:pPr>
+            <w:r>
+              <w:rPr>
+                <w:rFonts w:asciiTheme="majorBidi" w:hAnsiTheme="majorBidi" w:cstheme="majorBidi"/>
+              </w:rPr>
+              <w:t>CSI</w:t>
+            </w:r>
+          </w:p>
+        </w:tc>
+        <w:tc>
+          <w:tcPr>
+            <w:tcW w:w="1382" w:type="dxa"/>
+          </w:tcPr>
+          <w:p>
+            <w:pPr>
+              <w:pStyle w:val="Compact"/>
+              <w:rPr>
+                <w:rFonts w:asciiTheme="majorBidi" w:hAnsiTheme="majorBidi" w:cstheme="majorBidi"/>
+              </w:rPr>
+            </w:pPr>
+            <w:r>
+              <w:rPr>
+                <w:rFonts w:asciiTheme="majorBidi" w:hAnsiTheme="majorBidi" w:cstheme="majorBidi"/>
+              </w:rPr>
+              <w:t>~70-90</w:t>
+            </w:r>
+          </w:p>
+        </w:tc>
+        <w:tc>
+          <w:tcPr>
+            <w:tcW w:w="2033" w:type="dxa"/>
+          </w:tcPr>
+          <w:p>
+            <w:pPr>
+              <w:spacing w:line="330" w:lineRule="atLeast"/>
+              <w:rPr>
+                <w:rFonts w:asciiTheme="majorBidi" w:hAnsiTheme="majorBidi" w:cstheme="majorBidi"/>
+                <w:b/>
+                <w:bCs/>
+                <w:color w:val="E6E8F0"/>
+                <w:sz w:val="21"/>
+                <w:szCs w:val="21"/>
+              </w:rPr>
+            </w:pPr>
+            <w:r>
+              <w:rPr>
+                <w:rFonts w:ascii="Arial" w:hAnsi="Arial" w:cs="Arial"/>
+                <w:b/>
+                <w:bCs/>
+                <w:color w:val="E6E8F0"/>
+                <w:sz w:val="21"/>
+                <w:szCs w:val="21"/>
+              </w:rPr>
+              <w:br/>
+            </w:r>
+            <w:r>
+              <w:rPr>
+                <w:rStyle w:val="Strong"/>
+                <w:rFonts w:asciiTheme="majorBidi" w:hAnsiTheme="majorBidi" w:cstheme="majorBidi"/>
+                <w:b w:val="0"/>
+                <w:bCs w:val="0"/>
+                <w:color w:val="000000" w:themeColor="text1"/>
+                <w:sz w:val="21"/>
+                <w:szCs w:val="21"/>
+              </w:rPr>
+              <w:t>Integrated 12.3MP Sony IMX500 sensor with onboard ML processin</w:t>
+            </w:r>
+            <w:r>
+              <w:rPr>
+                <w:rStyle w:val="Strong"/>
+                <w:rFonts w:asciiTheme="majorBidi" w:hAnsiTheme="majorBidi" w:cstheme="majorBidi"/>
+                <w:b w:val="0"/>
+                <w:bCs w:val="0"/>
+                <w:color w:val="000000" w:themeColor="text1"/>
+                <w:sz w:val="21"/>
+                <w:szCs w:val="21"/>
+              </w:rPr>
+              <w:t>g</w:t>
+            </w:r>
+          </w:p>
+          <w:p>
+            <w:pPr>
+              <w:pStyle w:val="Compact"/>
+              <w:keepNext/>
+              <w:rPr>
+                <w:rFonts w:asciiTheme="majorBidi" w:hAnsiTheme="majorBidi" w:cstheme="majorBidi"/>
+              </w:rPr>
+            </w:pPr>
           </w:p>
         </w:tc>
       </w:tr>
@@ -6624,6 +6754,17 @@
       </w:r>
       <w:bookmarkEnd w:id="67"/>
       <w:bookmarkEnd w:id="68"/>
+    </w:p>
+    <w:p>
+      <w:pPr>
+        <w:pStyle w:val="Heading3"/>
+        <w:rPr>
+          <w:rFonts w:asciiTheme="majorBidi" w:hAnsiTheme="majorBidi"/>
+          <w:b/>
+          <w:bCs/>
+          <w:color w:val="auto"/>
+        </w:rPr>
+      </w:pPr>
     </w:p>
     <w:p>
       <w:pPr>
@@ -6787,6 +6928,7 @@
               <w:rPr>
                 <w:rFonts w:asciiTheme="majorBidi" w:hAnsiTheme="majorBidi" w:cstheme="majorBidi"/>
               </w:rPr>
+              <w:lastRenderedPageBreak/>
               <w:t>Component</w:t>
             </w:r>
           </w:p>
@@ -7135,7 +7277,6 @@
               <w:rPr>
                 <w:rFonts w:asciiTheme="majorBidi" w:hAnsiTheme="majorBidi" w:cstheme="majorBidi"/>
               </w:rPr>
-              <w:lastRenderedPageBreak/>
               <w:t>Actuators / Valves</w:t>
             </w:r>
           </w:p>
@@ -7554,6 +7695,7 @@
           <w:bCs/>
           <w:color w:val="auto"/>
         </w:rPr>
+        <w:lastRenderedPageBreak/>
         <w:t>6.3 Robotic Nozzle Control and Coordinate Transformation</w:t>
       </w:r>
       <w:bookmarkEnd w:id="81"/>
@@ -7914,7 +8056,6 @@
           <w:sz w:val="36"/>
           <w:szCs w:val="36"/>
         </w:rPr>
-        <w:lastRenderedPageBreak/>
         <w:t>Chapter 7</w:t>
       </w:r>
       <w:bookmarkEnd w:id="87"/>
@@ -8148,7 +8289,6 @@
           <w:bCs/>
           <w:color w:val="auto"/>
         </w:rPr>
-        <w:lastRenderedPageBreak/>
         <w:t>References</w:t>
       </w:r>
       <w:bookmarkEnd w:id="90"/>
@@ -8455,6 +8595,7 @@
         <w:rPr>
           <w:rFonts w:asciiTheme="majorBidi" w:hAnsiTheme="majorBidi" w:cstheme="majorBidi"/>
         </w:rPr>
+        <w:lastRenderedPageBreak/>
         <w:t>Nainar</w:t>
       </w:r>
       <w:proofErr w:type="spellEnd"/>
@@ -8534,7 +8675,6 @@
         <w:rPr>
           <w:rFonts w:asciiTheme="majorBidi" w:hAnsiTheme="majorBidi" w:cstheme="majorBidi"/>
         </w:rPr>
-        <w:lastRenderedPageBreak/>
         <w:t xml:space="preserve">Suh, Y. (2025). Vision-based detection algorithm for monitoring dynamic change of fire progression. Fire Technology, 61, 2571–2591. </w:t>
       </w:r>
       <w:hyperlink r:id="rId18" w:tgtFrame="_new" w:history="1">
@@ -9047,6 +9187,7 @@
     <w:lsdException w:name="footer" w:uiPriority="99" w:qFormat="1"/>
     <w:lsdException w:name="table of figures" w:uiPriority="99"/>
     <w:lsdException w:name="Hyperlink" w:uiPriority="99"/>
+    <w:lsdException w:name="Strong" w:uiPriority="22" w:qFormat="1"/>
     <w:lsdException w:name="Normal Table" w:semiHidden="1" w:unhideWhenUsed="1"/>
     <w:lsdException w:name="Table Simple 1" w:semiHidden="1" w:unhideWhenUsed="1"/>
     <w:lsdException w:name="Table Simple 2" w:semiHidden="1" w:unhideWhenUsed="1"/>
@@ -10549,6 +10690,26 @@
       <w:spacing w:after="0"/>
     </w:pPr>
   </w:style>
+  <w:style w:type="paragraph" w:styleId="ListParagraph">
+    <w:name w:val="List Paragraph"/>
+    <w:basedOn w:val="Normal"/>
+    <w:rsid w:val="00B106D6"/>
+    <w:pPr>
+      <w:ind w:left="720"/>
+      <w:contextualSpacing/>
+    </w:pPr>
+  </w:style>
+  <w:style w:type="character" w:styleId="Strong">
+    <w:name w:val="Strong"/>
+    <w:basedOn w:val="DefaultParagraphFont"/>
+    <w:uiPriority w:val="22"/>
+    <w:qFormat/>
+    <w:rsid w:val="00DF43FD"/>
+    <w:rPr>
+      <w:b/>
+      <w:bCs/>
+    </w:rPr>
+  </w:style>
 </w:styles>
 </file>
 

</xml_diff>